<commit_message>
Corrige le domaine, le contact et la lisibilité du guide RAG
Remplace transferai.africa par transferai.ci (page de garde, tableau
liens, pied de page), corrige la lettre R invisible dans le tableau
R-A-G (texte navy sur fond navy), et remplace le contact d'escalade
Fondateur par Manager des Opérations avec contact@transferai.ci.

Co-Authored-By: Claude Sonnet 5 <noreply@anthropic.com>
</commit_message>
<xml_diff>
--- a/docs/transferai-admin/Guide_RAG_TransferAI_Formation_Juillet2026_2026-07-08.docx
+++ b/docs/transferai-admin/Guide_RAG_TransferAI_Formation_Juillet2026_2026-07-08.docx
@@ -534,7 +534,7 @@
           <w:sz w:val="20"/>
           <w:szCs w:val="20"/>
         </w:rPr>
-        <w:t xml:space="preserve">contact@transferai.africa  |  www.transferai.africa</w:t>
+        <w:t xml:space="preserve">contact@transferai.ci  |  www.transferai.ci</w:t>
       </w:r>
     </w:p>
     <w:p>
@@ -907,7 +907,7 @@
                 <w:rFonts w:ascii="Arial" w:cs="Arial" w:eastAsia="Arial" w:hAnsi="Arial"/>
                 <w:b/>
                 <w:bCs/>
-                <w:color w:val="1B3F6E"/>
+                <w:color w:val="FFFFFF"/>
                 <w:sz w:val="20"/>
                 <w:szCs w:val="20"/>
               </w:rPr>
@@ -11573,7 +11573,7 @@
                 <w:sz w:val="20"/>
                 <w:szCs w:val="20"/>
               </w:rPr>
-              <w:t xml:space="preserve">Fondateur</w:t>
+              <w:t xml:space="preserve">Manager des Opérations</w:t>
             </w:r>
           </w:p>
         </w:tc>
@@ -11608,7 +11608,7 @@
                 <w:sz w:val="20"/>
                 <w:szCs w:val="20"/>
               </w:rPr>
-              <w:t xml:space="preserve">contact@transferai.africa</w:t>
+              <w:t xml:space="preserve">contact@transferai.ci</w:t>
             </w:r>
           </w:p>
         </w:tc>
@@ -12399,7 +12399,7 @@
           <w:sz w:val="20"/>
           <w:szCs w:val="20"/>
         </w:rPr>
-        <w:t xml:space="preserve">www.transferai.africa  |  contact@transferai.africa</w:t>
+        <w:t xml:space="preserve">www.transferai.ci  |  contact@transferai.ci</w:t>
       </w:r>
     </w:p>
     <w:sectPr>

</xml_diff>